<commit_message>
Unify document APIs and exporters
</commit_message>
<xml_diff>
--- a/examples/legal_demo-bound.docx
+++ b/examples/legal_demo-bound.docx
@@ -1,10 +1,10 @@
 
 <file path=word/document.xml><?xml version="1.0" encoding="utf-8"?>
-<w:document xmlns:w="http://schemas.openxmlformats.org/wordprocessingml/2006/main" xmlns:r="http://schemas.openxmlformats.org/officeDocument/2006/relationships" xmlns:wp="http://schemas.openxmlformats.org/drawingml/2006/wordprocessingDrawing" xmlns:a="http://schemas.openxmlformats.org/drawingml/2006/main" xmlns:pic="http://schemas.openxmlformats.org/drawingml/2006/picture" xmlns:m="http://schemas.openxmlformats.org/officeDocument/2006/math">
+<w:document xmlns="" xmlns:w="http://schemas.openxmlformats.org/wordprocessingml/2006/main" xmlns:r="http://schemas.openxmlformats.org/officeDocument/2006/relationships" xmlns:wp="http://schemas.openxmlformats.org/drawingml/2006/wordprocessingDrawing" xmlns:a="http://schemas.openxmlformats.org/drawingml/2006/main" xmlns:pic="http://schemas.openxmlformats.org/drawingml/2006/picture" xmlns:m="http://schemas.openxmlformats.org/officeDocument/2006/math">
   <w:body>
-    <w:p>
+    <w:p xmlns="" xmlns:w="http://schemas.openxmlformats.org/wordprocessingml/2006/main">
       <w:pPr>
-        <w:pStyle w:val="Heading1"/>
+        <w:pStyle w:val="Title"/>
       </w:pPr>
       <w:bookmarkStart w:id="1" w:name="sec_offer"/>
       <w:r>
@@ -12,7 +12,7 @@
       </w:r>
       <w:bookmarkEnd w:id="1"/>
     </w:p>
-    <w:p>
+    <w:p xmlns="" xmlns:w="http://schemas.openxmlformats.org/wordprocessingml/2006/main">
       <w:pPr>
         <w:pStyle w:val="FirstParagraph"/>
       </w:pPr>
@@ -79,34 +79,34 @@
       <w:r>
         <w:t xml:space="preserve">Sections </w:t>
       </w:r>
-      <w:fldSimple w:instr=" REF sec_comp \w \h ">
+      <w:fldSimple w:instr=" REF sec_comp \w \h " w:dirty="true">
         <w:r>
-          <w:t>#</w:t>
+          <w:t xml:space="preserve">#</w:t>
         </w:r>
       </w:fldSimple>
       <w:r>
         <w:t xml:space="preserve">, </w:t>
       </w:r>
-      <w:fldSimple w:instr=" REF sec_equity \w \h ">
+      <w:fldSimple w:instr=" REF sec_equity \w \h " w:dirty="true">
         <w:r>
-          <w:t>#</w:t>
+          <w:t xml:space="preserve">#</w:t>
         </w:r>
       </w:fldSimple>
       <w:r>
         <w:t xml:space="preserve"> and </w:t>
       </w:r>
-      <w:fldSimple w:instr=" REF sec_atwill \w \h ">
+      <w:fldSimple w:instr=" REF sec_atwill \w \h " w:dirty="true">
         <w:r>
-          <w:t>#</w:t>
+          <w:t xml:space="preserve">#</w:t>
         </w:r>
       </w:fldSimple>
       <w:r>
         <w:t>.</w:t>
       </w:r>
     </w:p>
-    <w:p>
+    <w:p xmlns="" xmlns:w="http://schemas.openxmlformats.org/wordprocessingml/2006/main">
       <w:pPr>
-        <w:pStyle w:val="Heading2"/>
+        <w:pStyle w:val="Heading1"/>
       </w:pPr>
       <w:bookmarkStart w:id="2" w:name="sec_comp"/>
       <w:r>
@@ -114,7 +114,7 @@
       </w:r>
       <w:bookmarkEnd w:id="2"/>
     </w:p>
-    <w:p>
+    <w:p xmlns="" xmlns:w="http://schemas.openxmlformats.org/wordprocessingml/2006/main">
       <w:pPr>
         <w:pStyle w:val="FirstParagraph"/>
       </w:pPr>
@@ -170,21 +170,18 @@
       <w:r>
         <w:t xml:space="preserve"> Salary is reviewed annually as part of the process described in </w:t>
       </w:r>
-      <w:r>
-        <w:t xml:space="preserve">Section </w:t>
-      </w:r>
-      <w:fldSimple w:instr=" REF sec_offer \w \h ">
+      <w:fldSimple w:instr=" REF sec_offer \h " w:dirty="true">
         <w:r>
-          <w:t>#</w:t>
+          <w:t xml:space="preserve">Offer of Employment</w:t>
         </w:r>
       </w:fldSimple>
       <w:r>
         <w:t>.</w:t>
       </w:r>
     </w:p>
-    <w:p>
+    <w:p xmlns="" xmlns:w="http://schemas.openxmlformats.org/wordprocessingml/2006/main">
       <w:pPr>
-        <w:pStyle w:val="Heading2"/>
+        <w:pStyle w:val="Heading1"/>
       </w:pPr>
       <w:bookmarkStart w:id="3" w:name="sec_equity"/>
       <w:r>
@@ -192,7 +189,7 @@
       </w:r>
       <w:bookmarkEnd w:id="3"/>
     </w:p>
-    <w:p>
+    <w:p xmlns="" xmlns:w="http://schemas.openxmlformats.org/wordprocessingml/2006/main">
       <w:pPr>
         <w:pStyle w:val="BodyText"/>
       </w:pPr>
@@ -200,7 +197,7 @@
         <w:t>«#equity.options»</w:t>
       </w:r>
     </w:p>
-    <w:p>
+    <w:p xmlns="" xmlns:w="http://schemas.openxmlformats.org/wordprocessingml/2006/main">
       <w:pPr>
         <w:pStyle w:val="FirstParagraph"/>
       </w:pPr>
@@ -288,7 +285,7 @@
         <w:t>.</w:t>
       </w:r>
     </w:p>
-    <w:p>
+    <w:p xmlns="" xmlns:w="http://schemas.openxmlformats.org/wordprocessingml/2006/main">
       <w:pPr>
         <w:pStyle w:val="BodyText"/>
       </w:pPr>
@@ -316,22 +313,25 @@
         <w:t xml:space="preserve"> shares in all:</w:t>
       </w:r>
     </w:p>
-    <w:tbl>
+    <w:tbl xmlns="" xmlns:w="http://schemas.openxmlformats.org/wordprocessingml/2006/main">
       <w:tblPr>
         <w:tblStyle w:val="TableGrid"/>
-        <w:tblW w:type="auto" w:w="0"/>
+        <w:tblW w:type="pct" w:w="5000"/>
         <w:tblLook w:val="04A0" w:firstRow="1" w:lastRow="0" w:firstColumn="0" w:lastColumn="0" w:noHBand="0" w:noVBand="1"/>
       </w:tblPr>
       <w:tblGrid>
-        <w:gridCol w:w="4680"/>
-        <w:gridCol w:w="4680"/>
+        <w:gridCol w:w="5616"/>
+        <w:gridCol w:w="3744"/>
       </w:tblGrid>
       <w:tr>
         <w:trPr>
+          <w:cantSplit w:val="on"/>
           <w:tblHeader/>
         </w:trPr>
         <w:tc>
-          <w:tcPr/>
+          <w:tcPr>
+            <w:tcW w:type="pct" w:w="3000"/>
+          </w:tcPr>
           <w:p>
             <w:pPr>
               <w:pStyle w:val="Compact"/>
@@ -346,7 +346,9 @@
           </w:p>
         </w:tc>
         <w:tc>
-          <w:tcPr/>
+          <w:tcPr>
+            <w:tcW w:type="pct" w:w="2000"/>
+          </w:tcPr>
           <w:p>
             <w:pPr>
               <w:pStyle w:val="Compact"/>
@@ -362,8 +364,12 @@
         </w:tc>
       </w:tr>
       <w:tr>
+        <w:trPr>
+          <w:cantSplit w:val="on"/>
+        </w:trPr>
         <w:tc>
           <w:tcPr>
+            <w:tcW w:type="pct" w:w="5000"/>
             <w:gridSpan w:val="2"/>
           </w:tcPr>
           <w:p>
@@ -377,8 +383,13 @@
         </w:tc>
       </w:tr>
       <w:tr>
+        <w:trPr>
+          <w:cantSplit w:val="on"/>
+        </w:trPr>
         <w:tc>
-          <w:tcPr/>
+          <w:tcPr>
+            <w:tcW w:type="pct" w:w="3000"/>
+          </w:tcPr>
           <w:p>
             <w:pPr>
               <w:pStyle w:val="Compact"/>
@@ -403,7 +414,9 @@
           </w:p>
         </w:tc>
         <w:tc>
-          <w:tcPr/>
+          <w:tcPr>
+            <w:tcW w:type="pct" w:w="2000"/>
+          </w:tcPr>
           <w:p>
             <w:pPr>
               <w:pStyle w:val="Compact"/>
@@ -429,8 +442,12 @@
         </w:tc>
       </w:tr>
       <w:tr>
+        <w:trPr>
+          <w:cantSplit w:val="on"/>
+        </w:trPr>
         <w:tc>
           <w:tcPr>
+            <w:tcW w:type="pct" w:w="5000"/>
             <w:gridSpan w:val="2"/>
           </w:tcPr>
           <w:p>
@@ -444,8 +461,8 @@
         </w:tc>
       </w:tr>
     </w:tbl>
-    <w:p/>
-    <w:p>
+    <w:p xmlns="" xmlns:w="http://schemas.openxmlformats.org/wordprocessingml/2006/main"/>
+    <w:p xmlns="" xmlns:w="http://schemas.openxmlformats.org/wordprocessingml/2006/main">
       <w:pPr>
         <w:pStyle w:val="BodyText"/>
       </w:pPr>
@@ -453,7 +470,7 @@
         <w:t>«/equity.options»</w:t>
       </w:r>
     </w:p>
-    <w:p>
+    <w:p xmlns="" xmlns:w="http://schemas.openxmlformats.org/wordprocessingml/2006/main">
       <w:pPr>
         <w:pStyle w:val="BodyText"/>
       </w:pPr>
@@ -461,7 +478,7 @@
         <w:t>«^equity.options»</w:t>
       </w:r>
     </w:p>
-    <w:p>
+    <w:p xmlns="" xmlns:w="http://schemas.openxmlformats.org/wordprocessingml/2006/main">
       <w:pPr>
         <w:pStyle w:val="FirstParagraph"/>
       </w:pPr>
@@ -469,7 +486,7 @@
         <w:t>This offer includes no stock option component.</w:t>
       </w:r>
     </w:p>
-    <w:p>
+    <w:p xmlns="" xmlns:w="http://schemas.openxmlformats.org/wordprocessingml/2006/main">
       <w:pPr>
         <w:pStyle w:val="BodyText"/>
       </w:pPr>
@@ -477,7 +494,7 @@
         <w:t>«/equity.options»</w:t>
       </w:r>
     </w:p>
-    <w:p>
+    <w:p xmlns="" xmlns:w="http://schemas.openxmlformats.org/wordprocessingml/2006/main">
       <w:pPr>
         <w:pStyle w:val="BodyText"/>
       </w:pPr>
@@ -485,7 +502,7 @@
         <w:t>«#equity.restricted_stock»</w:t>
       </w:r>
     </w:p>
-    <w:p>
+    <w:p xmlns="" xmlns:w="http://schemas.openxmlformats.org/wordprocessingml/2006/main">
       <w:pPr>
         <w:pStyle w:val="BodyText"/>
       </w:pPr>
@@ -553,7 +570,7 @@
         <w:t>.</w:t>
       </w:r>
     </w:p>
-    <w:p>
+    <w:p xmlns="" xmlns:w="http://schemas.openxmlformats.org/wordprocessingml/2006/main">
       <w:pPr>
         <w:pStyle w:val="BodyText"/>
       </w:pPr>
@@ -561,7 +578,7 @@
         <w:t>«/equity.restricted_stock»</w:t>
       </w:r>
     </w:p>
-    <w:p>
+    <w:p xmlns="" xmlns:w="http://schemas.openxmlformats.org/wordprocessingml/2006/main">
       <w:pPr>
         <w:pStyle w:val="BodyText"/>
       </w:pPr>
@@ -571,18 +588,18 @@
       <w:r>
         <w:t xml:space="preserve">your cash compensation </w:t>
       </w:r>
-      <w:fldSimple w:instr=" REF sec_comp \w \h ">
+      <w:fldSimple w:instr=" REF sec_comp \w \h " w:dirty="true">
         <w:r>
-          <w:t>#</w:t>
+          <w:t xml:space="preserve">#</w:t>
         </w:r>
       </w:fldSimple>
       <w:r>
         <w:t>.</w:t>
       </w:r>
     </w:p>
-    <w:p>
+    <w:p xmlns="" xmlns:w="http://schemas.openxmlformats.org/wordprocessingml/2006/main">
       <w:pPr>
-        <w:pStyle w:val="Heading2"/>
+        <w:pStyle w:val="Heading1"/>
       </w:pPr>
       <w:bookmarkStart w:id="4" w:name="sec_atwill"/>
       <w:r>
@@ -590,7 +607,7 @@
       </w:r>
       <w:bookmarkEnd w:id="4"/>
     </w:p>
-    <w:p>
+    <w:p xmlns="" xmlns:w="http://schemas.openxmlformats.org/wordprocessingml/2006/main">
       <w:pPr>
         <w:pStyle w:val="FirstParagraph"/>
       </w:pPr>
@@ -620,9 +637,9 @@
       <w:r>
         <w:t xml:space="preserve">Section </w:t>
       </w:r>
-      <w:fldSimple w:instr=" REF sec_comp \w \h ">
+      <w:fldSimple w:instr=" REF sec_comp \w \h " w:dirty="true">
         <w:r>
-          <w:t>#</w:t>
+          <w:t xml:space="preserve">#</w:t>
         </w:r>
       </w:fldSimple>
       <w:r>
@@ -631,23 +648,23 @@
       <w:r>
         <w:t xml:space="preserve">Section </w:t>
       </w:r>
-      <w:fldSimple w:instr=" REF sec_equity \w \h ">
+      <w:fldSimple w:instr=" REF sec_equity \w \h " w:dirty="true">
         <w:r>
-          <w:t>#</w:t>
+          <w:t xml:space="preserve">#</w:t>
         </w:r>
       </w:fldSimple>
       <w:r>
         <w:t xml:space="preserve"> changes that.</w:t>
       </w:r>
     </w:p>
-    <w:p>
+    <w:p xmlns="" xmlns:w="http://schemas.openxmlformats.org/wordprocessingml/2006/main">
       <w:pPr>
         <w:pBdr>
           <w:bottom w:val="single" w:sz="6" w:space="1" w:color="auto"/>
         </w:pBdr>
       </w:pPr>
     </w:p>
-    <w:p>
+    <w:p xmlns="" xmlns:w="http://schemas.openxmlformats.org/wordprocessingml/2006/main">
       <w:pPr>
         <w:pStyle w:val="FirstParagraph"/>
       </w:pPr>
@@ -675,7 +692,7 @@
         <w:t>.</w:t>
       </w:r>
     </w:p>
-    <w:tbl>
+    <w:tbl xmlns="" xmlns:w="http://schemas.openxmlformats.org/wordprocessingml/2006/main">
       <w:tblPr>
         <w:tblStyle w:val="BorderlessTable"/>
         <w:tblW w:type="auto" w:w="0"/>
@@ -686,6 +703,9 @@
         <w:gridCol w:w="4680"/>
       </w:tblGrid>
       <w:tr>
+        <w:trPr>
+          <w:cantSplit w:val="on"/>
+        </w:trPr>
         <w:tc>
           <w:tcPr/>
           <w:p>
@@ -730,6 +750,9 @@
         </w:tc>
       </w:tr>
       <w:tr>
+        <w:trPr>
+          <w:cantSplit w:val="on"/>
+        </w:trPr>
         <w:tc>
           <w:tcPr/>
           <w:p>
@@ -740,7 +763,13 @@
               <w:br/>
             </w:r>
             <w:r>
+              <w:t xml:space="preserve"> </w:t>
+            </w:r>
+            <w:r>
               <w:br/>
+            </w:r>
+            <w:r>
+              <w:t xml:space="preserve"> </w:t>
             </w:r>
             <w:r>
               <w:br/>
@@ -757,7 +786,13 @@
               <w:br/>
             </w:r>
             <w:r>
+              <w:t xml:space="preserve"> </w:t>
+            </w:r>
+            <w:r>
               <w:br/>
+            </w:r>
+            <w:r>
+              <w:t xml:space="preserve"> </w:t>
             </w:r>
             <w:r>
               <w:br/>
@@ -766,6 +801,9 @@
         </w:tc>
       </w:tr>
       <w:tr>
+        <w:trPr>
+          <w:cantSplit w:val="on"/>
+        </w:trPr>
         <w:tc>
           <w:tcPr/>
           <w:p>
@@ -790,6 +828,9 @@
         </w:tc>
       </w:tr>
       <w:tr>
+        <w:trPr>
+          <w:cantSplit w:val="on"/>
+        </w:trPr>
         <w:tc>
           <w:tcPr/>
           <w:p>
@@ -877,6 +918,9 @@
         </w:tc>
       </w:tr>
       <w:tr>
+        <w:trPr>
+          <w:cantSplit w:val="on"/>
+        </w:trPr>
         <w:tc>
           <w:tcPr/>
           <w:p>
@@ -935,8 +979,8 @@
         </w:tc>
       </w:tr>
     </w:tbl>
-    <w:p/>
-    <w:p>
+    <w:p xmlns="" xmlns:w="http://schemas.openxmlformats.org/wordprocessingml/2006/main"/>
+    <w:p xmlns="" xmlns:w="http://schemas.openxmlformats.org/wordprocessingml/2006/main">
       <w:pPr>
         <w:pStyle w:val="FirstParagraph"/>
       </w:pPr>
@@ -946,33 +990,35 @@
       <w:r>
         <w:t xml:space="preserve">Sections </w:t>
       </w:r>
-      <w:fldSimple w:instr=" REF sec_comp \w \h ">
+      <w:fldSimple w:instr=" REF sec_comp \w \h " w:dirty="true">
         <w:r>
-          <w:t>#</w:t>
+          <w:t xml:space="preserve">#</w:t>
         </w:r>
       </w:fldSimple>
       <w:r>
         <w:t xml:space="preserve">, </w:t>
       </w:r>
-      <w:fldSimple w:instr=" REF sec_equity \w \h ">
+      <w:fldSimple w:instr=" REF sec_equity \w \h " w:dirty="true">
         <w:r>
-          <w:t>#</w:t>
+          <w:t xml:space="preserve">#</w:t>
         </w:r>
       </w:fldSimple>
       <w:r>
         <w:t xml:space="preserve"> and </w:t>
       </w:r>
-      <w:fldSimple w:instr=" REF sec_atwill \w \h ">
+      <w:fldSimple w:instr=" REF sec_atwill \w \h " w:dirty="true">
         <w:r>
-          <w:t>#</w:t>
+          <w:t xml:space="preserve">#</w:t>
         </w:r>
       </w:fldSimple>
       <w:r>
         <w:t xml:space="preserve"> are the entire agreement.</w:t>
       </w:r>
     </w:p>
-    <w:sectPr>
-      <w:pgSz w:w="12240" w:h="15840"/>
+    <w:sectPr xmlns="" xmlns:wpc="http://schemas.microsoft.com/office/word/2010/wordprocessingCanvas" xmlns:mc="http://schemas.openxmlformats.org/markup-compatibility/2006" xmlns:o="urn:schemas-microsoft-com:office:office" xmlns:r="http://schemas.openxmlformats.org/officeDocument/2006/relationships" xmlns:m="http://schemas.openxmlformats.org/officeDocument/2006/math" xmlns:v="urn:schemas-microsoft-com:vml" xmlns:wp14="http://schemas.microsoft.com/office/word/2010/wordprocessingDrawing" xmlns:wp="http://schemas.openxmlformats.org/drawingml/2006/wordprocessingDrawing" xmlns:w10="urn:schemas-microsoft-com:office:word" xmlns:w="http://schemas.openxmlformats.org/wordprocessingml/2006/main" xmlns:w14="http://schemas.microsoft.com/office/word/2010/wordml" xmlns:w15="http://schemas.microsoft.com/office/word/2012/wordml" xmlns:wpg="http://schemas.microsoft.com/office/word/2010/wordprocessingGroup" xmlns:wpi="http://schemas.microsoft.com/office/word/2010/wordprocessingInk" xmlns:wne="http://schemas.microsoft.com/office/word/2006/wordml" xmlns:wps="http://schemas.microsoft.com/office/word/2010/wordprocessingShape" xmlns:w16se="http://schemas.microsoft.com/office/word/2015/wordml/symex" xmlns:w16cid="http://schemas.microsoft.com/office/word/2016/wordml/cid" xmlns:w16="http://schemas.microsoft.com/office/word/2018/wordml" xmlns:w16cex="http://schemas.microsoft.com/office/word/2018/wordml/cex" xmlns:w16sdtdh="http://schemas.microsoft.com/office/word/2020/wordml/sdtdatahash" xmlns:w16sdtfl="http://schemas.microsoft.com/office/word/2024/wordml/sdtformatlock">
+      <w:headerReference w:type="default" r:id="Recbea8f9d5ca4316"/>
+      <w:footerReference w:type="default" r:id="R599f4c8959af4299"/>
+      <w:pgSz w:w="12240" w:h="15840" w:orient="portrait"/>
       <w:pgMar w:top="1440" w:right="1440" w:bottom="1440" w:left="1440" w:header="720" w:footer="720" w:gutter="0"/>
       <w:cols w:space="720"/>
       <w:docGrid w:linePitch="360"/>
@@ -981,12 +1027,82 @@
 </w:document>
 </file>
 
+<file path=word/footer.xml><?xml version="1.0" encoding="utf-8"?>
+<w:ftr xmlns:w14="http://schemas.microsoft.com/office/word/2010/wordml" xmlns:w="http://schemas.openxmlformats.org/wordprocessingml/2006/main">
+  <w:tbl>
+    <w:tblPr>
+      <w:tblStyle w:val="TableNormal"/>
+      <w:bidiVisual w:val="off"/>
+      <w:tblW w:w="0" w:type="auto"/>
+      <w:tblLook w:val="06A0" w:firstRow="1" w:lastRow="0" w:firstColumn="1" w:lastColumn="0" w:noHBand="1" w:noVBand="1"/>
+    </w:tblPr>
+    <w:tblGrid>
+      <w:gridCol w:w="3120"/>
+      <w:gridCol w:w="3120"/>
+      <w:gridCol w:w="3120"/>
+    </w:tblGrid>
+    <w:tr>
+      <w:trPr>
+        <w:trHeight w:val="300"/>
+      </w:trPr>
+      <w:tc>
+        <w:tcPr>
+          <w:tcW w:w="3120" w:type="dxa"/>
+          <w:tcMar/>
+        </w:tcPr>
+        <w:p>
+          <w:pPr>
+            <w:pStyle w:val="Header"/>
+            <w:bidi w:val="0"/>
+            <w:ind w:left="-115"/>
+            <w:jc w:val="left"/>
+          </w:pPr>
+        </w:p>
+      </w:tc>
+      <w:tc>
+        <w:tcPr>
+          <w:tcW w:w="3120" w:type="dxa"/>
+          <w:tcMar/>
+        </w:tcPr>
+        <w:p>
+          <w:pPr>
+            <w:pStyle w:val="Header"/>
+            <w:bidi w:val="0"/>
+            <w:jc w:val="center"/>
+          </w:pPr>
+        </w:p>
+      </w:tc>
+      <w:tc>
+        <w:tcPr>
+          <w:tcW w:w="3120" w:type="dxa"/>
+          <w:tcMar/>
+        </w:tcPr>
+        <w:p>
+          <w:pPr>
+            <w:pStyle w:val="Header"/>
+            <w:bidi w:val="0"/>
+            <w:ind w:right="-115"/>
+            <w:jc w:val="right"/>
+          </w:pPr>
+        </w:p>
+      </w:tc>
+    </w:tr>
+  </w:tbl>
+  <w:p>
+    <w:pPr>
+      <w:pStyle w:val="Footer"/>
+      <w:bidi w:val="0"/>
+    </w:pPr>
+  </w:p>
+</w:ftr>
+</file>
+
 <file path=word/footnotes.xml><?xml version="1.0" encoding="utf-8"?>
-<w:footnotes xmlns:w="http://schemas.openxmlformats.org/wordprocessingml/2006/main" xmlns:r="http://schemas.openxmlformats.org/officeDocument/2006/relationships">
+<w:footnotes xmlns:w="http://schemas.openxmlformats.org/wordprocessingml/2006/main">
   <w:footnote w:type="separator" w:id="-1">
     <w:p>
       <w:pPr>
-        <w:spacing w:after="0"/>
+        <w:spacing w:after="0" w:line="240" w:lineRule="auto"/>
       </w:pPr>
       <w:r>
         <w:separator/>
@@ -996,7 +1112,7 @@
   <w:footnote w:type="continuationSeparator" w:id="0">
     <w:p>
       <w:pPr>
-        <w:spacing w:after="0"/>
+        <w:spacing w:after="0" w:line="240" w:lineRule="auto"/>
       </w:pPr>
       <w:r>
         <w:continuationSeparator/>
@@ -1018,63 +1134,134 @@
         <w:t xml:space="preserve"> </w:t>
       </w:r>
       <w:r>
-        <w:t xml:space="preserve">Including any deductions you authorize in writing. </w:t>
+        <w:t>Including any deductions you authorize in writing.</w:t>
       </w:r>
     </w:p>
   </w:footnote>
 </w:footnotes>
 </file>
 
+<file path=word/header.xml><?xml version="1.0" encoding="utf-8"?>
+<w:hdr xmlns:w14="http://schemas.microsoft.com/office/word/2010/wordml" xmlns:w="http://schemas.openxmlformats.org/wordprocessingml/2006/main">
+  <w:tbl>
+    <w:tblPr>
+      <w:tblStyle w:val="TableNormal"/>
+      <w:bidiVisual w:val="off"/>
+      <w:tblW w:w="0" w:type="auto"/>
+      <w:tblLook w:val="06A0" w:firstRow="1" w:lastRow="0" w:firstColumn="1" w:lastColumn="0" w:noHBand="1" w:noVBand="1"/>
+    </w:tblPr>
+    <w:tblGrid>
+      <w:gridCol w:w="3120"/>
+      <w:gridCol w:w="3120"/>
+      <w:gridCol w:w="3120"/>
+    </w:tblGrid>
+    <w:tr>
+      <w:trPr>
+        <w:trHeight w:val="300"/>
+      </w:trPr>
+      <w:tc>
+        <w:tcPr>
+          <w:tcW w:w="3120" w:type="dxa"/>
+          <w:tcMar/>
+        </w:tcPr>
+        <w:p>
+          <w:pPr>
+            <w:pStyle w:val="Header"/>
+            <w:bidi w:val="0"/>
+            <w:ind w:left="-115"/>
+            <w:jc w:val="left"/>
+          </w:pPr>
+        </w:p>
+      </w:tc>
+      <w:tc>
+        <w:tcPr>
+          <w:tcW w:w="3120" w:type="dxa"/>
+          <w:tcMar/>
+        </w:tcPr>
+        <w:p>
+          <w:pPr>
+            <w:pStyle w:val="Header"/>
+            <w:bidi w:val="0"/>
+            <w:jc w:val="center"/>
+          </w:pPr>
+        </w:p>
+      </w:tc>
+      <w:tc>
+        <w:tcPr>
+          <w:tcW w:w="3120" w:type="dxa"/>
+          <w:tcMar/>
+        </w:tcPr>
+        <w:p>
+          <w:pPr>
+            <w:pStyle w:val="Header"/>
+            <w:bidi w:val="0"/>
+            <w:ind w:right="-115"/>
+            <w:jc w:val="right"/>
+          </w:pPr>
+        </w:p>
+      </w:tc>
+    </w:tr>
+  </w:tbl>
+  <w:p>
+    <w:pPr>
+      <w:pStyle w:val="Header"/>
+      <w:bidi w:val="0"/>
+    </w:pPr>
+  </w:p>
+</w:hdr>
+</file>
+
 <file path=word/numbering.xml><?xml version="1.0" encoding="utf-8"?>
 <w:numbering xmlns:w="http://schemas.openxmlformats.org/wordprocessingml/2006/main">
-  <w:abstractNum w:abstractNumId="2">
+  <w:abstractNum w:abstractNumId="3">
     <w:multiLevelType w:val="multilevel"/>
     <w:lvl w:ilvl="0">
       <w:start w:val="1"/>
       <w:numFmt w:val="decimal"/>
-      <w:pStyle w:val="Heading1"/>
-      <w:lvlText w:val="%1."/>
+      <w:pStyle w:val="Title"/>
+      <w:suff w:val="nothing"/>
+      <w:lvlText w:val=""/>
       <w:lvlJc w:val="left"/>
     </w:lvl>
     <w:lvl w:ilvl="1">
       <w:start w:val="1"/>
-      <w:numFmt w:val="lowerLetter"/>
-      <w:pStyle w:val="Heading2"/>
-      <w:lvlText w:val="(%2)"/>
+      <w:numFmt w:val="decimal"/>
+      <w:pStyle w:val="Heading1"/>
+      <w:lvlText w:val="%2."/>
       <w:lvlJc w:val="left"/>
     </w:lvl>
     <w:lvl w:ilvl="2">
       <w:start w:val="1"/>
-      <w:numFmt w:val="lowerRoman"/>
-      <w:pStyle w:val="Heading3"/>
+      <w:numFmt w:val="lowerLetter"/>
+      <w:pStyle w:val="Heading2"/>
       <w:lvlText w:val="(%3)"/>
       <w:lvlJc w:val="left"/>
     </w:lvl>
     <w:lvl w:ilvl="3">
       <w:start w:val="1"/>
-      <w:numFmt w:val="upperLetter"/>
-      <w:pStyle w:val="Heading4"/>
+      <w:numFmt w:val="lowerRoman"/>
+      <w:pStyle w:val="Heading3"/>
       <w:lvlText w:val="(%4)"/>
       <w:lvlJc w:val="left"/>
     </w:lvl>
     <w:lvl w:ilvl="4">
       <w:start w:val="1"/>
-      <w:numFmt w:val="upperRoman"/>
-      <w:pStyle w:val="Heading5"/>
+      <w:numFmt w:val="upperLetter"/>
+      <w:pStyle w:val="Heading4"/>
       <w:lvlText w:val="(%5)"/>
       <w:lvlJc w:val="left"/>
     </w:lvl>
     <w:lvl w:ilvl="5">
       <w:start w:val="1"/>
-      <w:numFmt w:val="decimal"/>
-      <w:pStyle w:val="Heading6"/>
+      <w:numFmt w:val="upperRoman"/>
+      <w:pStyle w:val="Heading5"/>
       <w:lvlText w:val="(%6)"/>
       <w:lvlJc w:val="left"/>
     </w:lvl>
     <w:lvl w:ilvl="6">
       <w:start w:val="1"/>
       <w:numFmt w:val="decimal"/>
-      <w:lvlText w:val="%7."/>
+      <w:lvlText w:val="(%7)"/>
       <w:lvlJc w:val="left"/>
     </w:lvl>
     <w:lvl w:ilvl="7">
@@ -1090,42 +1277,40 @@
       <w:lvlJc w:val="left"/>
     </w:lvl>
   </w:abstractNum>
-  <w:num w:numId="1">
-    <w:abstractNumId w:val="2"/>
+  <w:num w:numId="4">
+    <w:abstractNumId w:val="3"/>
   </w:num>
 </w:numbering>
 </file>
 
 <file path=word/styles.xml><?xml version="1.0" encoding="utf-8"?>
-<w:styles xmlns:mc="http://schemas.openxmlformats.org/markup-compatibility/2006" xmlns:r="http://schemas.openxmlformats.org/officeDocument/2006/relationships" xmlns:w="http://schemas.openxmlformats.org/wordprocessingml/2006/main" xmlns:w14="http://schemas.microsoft.com/office/word/2010/wordml" xmlns:w15="http://schemas.microsoft.com/office/word/2012/wordml" xmlns:w16cex="http://schemas.microsoft.com/office/word/2018/wordml/cex" xmlns:w16cid="http://schemas.microsoft.com/office/word/2016/wordml/cid" xmlns:w16="http://schemas.microsoft.com/office/word/2018/wordml" xmlns:w16sdtdh="http://schemas.microsoft.com/office/word/2020/wordml/sdtdatahash" xmlns:w16sdtfl="http://schemas.microsoft.com/office/word/2024/wordml/sdtformatlock" xmlns:w16se="http://schemas.microsoft.com/office/word/2015/wordml/symex" xmlns:w16du="http://schemas.microsoft.com/office/word/2023/wordml/word16du" mc:Ignorable="w14 w15 w16se w16cid w16 w16cex w16sdtdh w16sdtfl w16du">
+<w:styles xmlns:wp14="http://schemas.microsoft.com/office/word/2010/wordprocessingDrawing" xmlns:mc="http://schemas.openxmlformats.org/markup-compatibility/2006" xmlns:r="http://schemas.openxmlformats.org/officeDocument/2006/relationships" xmlns:w="http://schemas.openxmlformats.org/wordprocessingml/2006/main" xmlns:w14="http://schemas.microsoft.com/office/word/2010/wordml" xmlns:w15="http://schemas.microsoft.com/office/word/2012/wordml" xmlns:w16se="http://schemas.microsoft.com/office/word/2015/wordml/symex" xmlns:w16cid="http://schemas.microsoft.com/office/word/2016/wordml/cid" xmlns:w16="http://schemas.microsoft.com/office/word/2018/wordml" xmlns:w16cex="http://schemas.microsoft.com/office/word/2018/wordml/cex" xmlns:w16sdtdh="http://schemas.microsoft.com/office/word/2020/wordml/sdtdatahash" xmlns:w16sdtfl="http://schemas.microsoft.com/office/word/2024/wordml/sdtformatlock" mc:Ignorable="w14 w15 wp14 w16se w16cid w16 w16cex w16sdtdh w16sdtfl">
   <w:docDefaults>
     <w:rPrDefault>
       <w:rPr>
-        <w:rFonts w:asciiTheme="minorHAnsi" w:eastAsiaTheme="minorEastAsia" w:hAnsiTheme="minorHAnsi" w:cstheme="minorBidi"/>
-        <w:kern w:val="2"/>
+        <w:rFonts w:asciiTheme="minorHAnsi" w:hAnsiTheme="minorHAnsi" w:eastAsiaTheme="minorEastAsia" w:cstheme="minorBidi"/>
         <w:sz w:val="24"/>
         <w:szCs w:val="24"/>
-        <w:lang w:val="en-US" w:eastAsia="zh-CN" w:bidi="ar-SA"/>
-        <w14:ligatures w14:val="standardContextual"/>
+        <w:lang w:val="en-US" w:eastAsia="ja-JP" w:bidi="ar-SA"/>
       </w:rPr>
     </w:rPrDefault>
     <w:pPrDefault>
       <w:pPr>
-        <w:spacing w:after="160" w:line="278" w:lineRule="auto"/>
+        <w:spacing w:after="160" w:line="279" w:lineRule="auto"/>
       </w:pPr>
     </w:pPrDefault>
   </w:docDefaults>
-  <w:latentStyles w:defLockedState="0" w:defUIPriority="99" w:defSemiHidden="0" w:defUnhideWhenUsed="0" w:defQFormat="0" w:count="376">
+  <w:latentStyles w:defLockedState="0" w:defUIPriority="99" w:defSemiHidden="0" w:defUnhideWhenUsed="0" w:defQFormat="0" w:count="371">
     <w:lsdException w:name="Normal" w:uiPriority="0" w:qFormat="1"/>
     <w:lsdException w:name="heading 1" w:uiPriority="9" w:qFormat="1"/>
-    <w:lsdException w:name="heading 2" w:semiHidden="1" w:uiPriority="9" w:unhideWhenUsed="1" w:qFormat="1"/>
-    <w:lsdException w:name="heading 3" w:semiHidden="1" w:uiPriority="9" w:unhideWhenUsed="1" w:qFormat="1"/>
-    <w:lsdException w:name="heading 4" w:semiHidden="1" w:uiPriority="9" w:unhideWhenUsed="1" w:qFormat="1"/>
-    <w:lsdException w:name="heading 5" w:semiHidden="1" w:uiPriority="9" w:unhideWhenUsed="1" w:qFormat="1"/>
-    <w:lsdException w:name="heading 6" w:semiHidden="1" w:uiPriority="9" w:unhideWhenUsed="1" w:qFormat="1"/>
-    <w:lsdException w:name="heading 7" w:semiHidden="1" w:uiPriority="9" w:unhideWhenUsed="1" w:qFormat="1"/>
-    <w:lsdException w:name="heading 8" w:semiHidden="1" w:uiPriority="9" w:unhideWhenUsed="1" w:qFormat="1"/>
-    <w:lsdException w:name="heading 9" w:semiHidden="1" w:uiPriority="9" w:unhideWhenUsed="1" w:qFormat="1"/>
+    <w:lsdException w:name="heading 2" w:uiPriority="9" w:semiHidden="1" w:unhideWhenUsed="1" w:qFormat="1"/>
+    <w:lsdException w:name="heading 3" w:uiPriority="9" w:semiHidden="1" w:unhideWhenUsed="1" w:qFormat="1"/>
+    <w:lsdException w:name="heading 4" w:uiPriority="9" w:semiHidden="1" w:unhideWhenUsed="1" w:qFormat="1"/>
+    <w:lsdException w:name="heading 5" w:uiPriority="9" w:semiHidden="1" w:unhideWhenUsed="1" w:qFormat="1"/>
+    <w:lsdException w:name="heading 6" w:uiPriority="9" w:semiHidden="1" w:unhideWhenUsed="1" w:qFormat="1"/>
+    <w:lsdException w:name="heading 7" w:uiPriority="9" w:semiHidden="1" w:unhideWhenUsed="1" w:qFormat="1"/>
+    <w:lsdException w:name="heading 8" w:uiPriority="9" w:semiHidden="1" w:unhideWhenUsed="1" w:qFormat="1"/>
+    <w:lsdException w:name="heading 9" w:uiPriority="9" w:semiHidden="1" w:unhideWhenUsed="1" w:qFormat="1"/>
     <w:lsdException w:name="index 1" w:semiHidden="1" w:unhideWhenUsed="1"/>
     <w:lsdException w:name="index 2" w:semiHidden="1" w:unhideWhenUsed="1"/>
     <w:lsdException w:name="index 3" w:semiHidden="1" w:unhideWhenUsed="1"/>
@@ -1135,22 +1320,22 @@
     <w:lsdException w:name="index 7" w:semiHidden="1" w:unhideWhenUsed="1"/>
     <w:lsdException w:name="index 8" w:semiHidden="1" w:unhideWhenUsed="1"/>
     <w:lsdException w:name="index 9" w:semiHidden="1" w:unhideWhenUsed="1"/>
-    <w:lsdException w:name="toc 1" w:semiHidden="1" w:uiPriority="39" w:unhideWhenUsed="1"/>
-    <w:lsdException w:name="toc 2" w:semiHidden="1" w:uiPriority="39" w:unhideWhenUsed="1"/>
-    <w:lsdException w:name="toc 3" w:semiHidden="1" w:uiPriority="39" w:unhideWhenUsed="1"/>
-    <w:lsdException w:name="toc 4" w:semiHidden="1" w:uiPriority="39" w:unhideWhenUsed="1"/>
-    <w:lsdException w:name="toc 5" w:semiHidden="1" w:uiPriority="39" w:unhideWhenUsed="1"/>
-    <w:lsdException w:name="toc 6" w:semiHidden="1" w:uiPriority="39" w:unhideWhenUsed="1"/>
-    <w:lsdException w:name="toc 7" w:semiHidden="1" w:uiPriority="39" w:unhideWhenUsed="1"/>
-    <w:lsdException w:name="toc 8" w:semiHidden="1" w:uiPriority="39" w:unhideWhenUsed="1"/>
-    <w:lsdException w:name="toc 9" w:semiHidden="1" w:uiPriority="39" w:unhideWhenUsed="1"/>
+    <w:lsdException w:name="toc 1" w:uiPriority="39" w:semiHidden="1" w:unhideWhenUsed="1"/>
+    <w:lsdException w:name="toc 2" w:uiPriority="39" w:semiHidden="1" w:unhideWhenUsed="1"/>
+    <w:lsdException w:name="toc 3" w:uiPriority="39" w:semiHidden="1" w:unhideWhenUsed="1"/>
+    <w:lsdException w:name="toc 4" w:uiPriority="39" w:semiHidden="1" w:unhideWhenUsed="1"/>
+    <w:lsdException w:name="toc 5" w:uiPriority="39" w:semiHidden="1" w:unhideWhenUsed="1"/>
+    <w:lsdException w:name="toc 6" w:uiPriority="39" w:semiHidden="1" w:unhideWhenUsed="1"/>
+    <w:lsdException w:name="toc 7" w:uiPriority="39" w:semiHidden="1" w:unhideWhenUsed="1"/>
+    <w:lsdException w:name="toc 8" w:uiPriority="39" w:semiHidden="1" w:unhideWhenUsed="1"/>
+    <w:lsdException w:name="toc 9" w:uiPriority="39" w:semiHidden="1" w:unhideWhenUsed="1"/>
     <w:lsdException w:name="Normal Indent" w:semiHidden="1" w:unhideWhenUsed="1"/>
     <w:lsdException w:name="footnote text" w:semiHidden="1" w:unhideWhenUsed="1"/>
     <w:lsdException w:name="annotation text" w:semiHidden="1" w:unhideWhenUsed="1"/>
     <w:lsdException w:name="header" w:semiHidden="1" w:unhideWhenUsed="1"/>
     <w:lsdException w:name="footer" w:semiHidden="1" w:unhideWhenUsed="1"/>
     <w:lsdException w:name="index heading" w:semiHidden="1" w:unhideWhenUsed="1"/>
-    <w:lsdException w:name="caption" w:semiHidden="1" w:uiPriority="35" w:unhideWhenUsed="1" w:qFormat="1"/>
+    <w:lsdException w:name="caption" w:uiPriority="35" w:semiHidden="1" w:unhideWhenUsed="1" w:qFormat="1"/>
     <w:lsdException w:name="table of figures" w:semiHidden="1" w:unhideWhenUsed="1"/>
     <w:lsdException w:name="envelope address" w:semiHidden="1" w:unhideWhenUsed="1"/>
     <w:lsdException w:name="envelope return" w:semiHidden="1" w:unhideWhenUsed="1"/>
@@ -1181,7 +1366,7 @@
     <w:lsdException w:name="Title" w:uiPriority="10" w:qFormat="1"/>
     <w:lsdException w:name="Closing" w:semiHidden="1" w:unhideWhenUsed="1"/>
     <w:lsdException w:name="Signature" w:semiHidden="1" w:unhideWhenUsed="1"/>
-    <w:lsdException w:name="Default Paragraph Font" w:semiHidden="1" w:uiPriority="1" w:unhideWhenUsed="1"/>
+    <w:lsdException w:name="Default Paragraph Font" w:uiPriority="1" w:semiHidden="1" w:unhideWhenUsed="1"/>
     <w:lsdException w:name="Body Text" w:semiHidden="1" w:unhideWhenUsed="1"/>
     <w:lsdException w:name="Body Text Indent" w:semiHidden="1" w:unhideWhenUsed="1"/>
     <w:lsdException w:name="List Continue" w:semiHidden="1" w:unhideWhenUsed="1"/>
@@ -1381,8 +1566,8 @@
     <w:lsdException w:name="Subtle Reference" w:uiPriority="31" w:qFormat="1"/>
     <w:lsdException w:name="Intense Reference" w:uiPriority="32" w:qFormat="1"/>
     <w:lsdException w:name="Book Title" w:uiPriority="33" w:qFormat="1"/>
-    <w:lsdException w:name="Bibliography" w:semiHidden="1" w:uiPriority="37" w:unhideWhenUsed="1"/>
-    <w:lsdException w:name="TOC Heading" w:semiHidden="1" w:uiPriority="39" w:unhideWhenUsed="1" w:qFormat="1"/>
+    <w:lsdException w:name="Bibliography" w:uiPriority="37" w:semiHidden="1" w:unhideWhenUsed="1"/>
+    <w:lsdException w:name="TOC Heading" w:uiPriority="39" w:semiHidden="1" w:unhideWhenUsed="1" w:qFormat="1"/>
     <w:lsdException w:name="Plain Table 1" w:uiPriority="41"/>
     <w:lsdException w:name="Plain Table 2" w:uiPriority="42"/>
     <w:lsdException w:name="Plain Table 3" w:uiPriority="43"/>
@@ -1487,181 +1672,18 @@
     <w:lsdException w:name="List Table 5 Dark Accent 6" w:uiPriority="50"/>
     <w:lsdException w:name="List Table 6 Colorful Accent 6" w:uiPriority="51"/>
     <w:lsdException w:name="List Table 7 Colorful Accent 6" w:uiPriority="52"/>
-    <w:lsdException w:name="Mention" w:semiHidden="1" w:unhideWhenUsed="1"/>
-    <w:lsdException w:name="Smart Hyperlink" w:semiHidden="1" w:unhideWhenUsed="1"/>
-    <w:lsdException w:name="Hashtag" w:semiHidden="1" w:unhideWhenUsed="1"/>
-    <w:lsdException w:name="Unresolved Mention" w:semiHidden="1" w:unhideWhenUsed="1"/>
-    <w:lsdException w:name="Smart Link" w:semiHidden="1" w:unhideWhenUsed="1"/>
   </w:latentStyles>
-  <w:style w:type="paragraph" w:default="1" w:styleId="Normal">
+  <w:style w:type="paragraph" w:styleId="Normal" w:default="1">
     <w:name w:val="Normal"/>
     <w:qFormat/>
   </w:style>
-  <w:style w:type="paragraph" w:styleId="Heading1">
-    <w:name w:val="heading 1"/>
-    <w:basedOn w:val="Normal"/>
-    <w:next w:val="FirstParagraph"/>
-    <w:link w:val="Heading1Char"/>
-    <w:uiPriority w:val="9"/>
-    <w:qFormat/>
-    <w:rsid w:val="00F81AA1"/>
-    <w:pPr>
-      <w:keepNext/>
-      <w:keepLines/>
-      <w:numPr>
-        <w:ilvl w:val="0"/>
-        <w:numId w:val="1"/>
-      </w:numPr>
-      <w:spacing w:before="360" w:after="80"/>
-      <w:outlineLvl w:val="0"/>
-    </w:pPr>
-    <w:rPr>
-      <w:rFonts w:asciiTheme="majorHAnsi" w:eastAsiaTheme="majorEastAsia" w:hAnsiTheme="majorHAnsi" w:cstheme="majorBidi"/>
-      <w:color w:val="0F4761" w:themeColor="accent1" w:themeShade="BF"/>
-      <w:sz w:val="40"/>
-      <w:szCs w:val="40"/>
-    </w:rPr>
-  </w:style>
-  <w:style w:type="paragraph" w:styleId="Heading2">
-    <w:name w:val="heading 2"/>
-    <w:basedOn w:val="Normal"/>
-    <w:next w:val="FirstParagraph"/>
-    <w:link w:val="Heading2Char"/>
-    <w:uiPriority w:val="9"/>
-    <w:semiHidden/>
-    <w:unhideWhenUsed/>
-    <w:qFormat/>
-    <w:rsid w:val="00F81AA1"/>
-    <w:pPr>
-      <w:keepNext/>
-      <w:keepLines/>
-      <w:numPr>
-        <w:ilvl w:val="1"/>
-        <w:numId w:val="1"/>
-      </w:numPr>
-      <w:spacing w:before="160" w:after="80"/>
-      <w:outlineLvl w:val="1"/>
-    </w:pPr>
-    <w:rPr>
-      <w:rFonts w:asciiTheme="majorHAnsi" w:eastAsiaTheme="majorEastAsia" w:hAnsiTheme="majorHAnsi" w:cstheme="majorBidi"/>
-      <w:color w:val="0F4761" w:themeColor="accent1" w:themeShade="BF"/>
-      <w:sz w:val="32"/>
-      <w:szCs w:val="32"/>
-    </w:rPr>
-  </w:style>
-  <w:style w:type="paragraph" w:styleId="Heading3">
-    <w:name w:val="heading 3"/>
-    <w:basedOn w:val="Normal"/>
-    <w:next w:val="FirstParagraph"/>
-    <w:link w:val="Heading3Char"/>
-    <w:uiPriority w:val="9"/>
-    <w:semiHidden/>
-    <w:unhideWhenUsed/>
-    <w:qFormat/>
-    <w:rsid w:val="00F81AA1"/>
-    <w:pPr>
-      <w:keepNext/>
-      <w:keepLines/>
-      <w:numPr>
-        <w:ilvl w:val="2"/>
-        <w:numId w:val="1"/>
-      </w:numPr>
-      <w:spacing w:before="160" w:after="80"/>
-      <w:outlineLvl w:val="2"/>
-    </w:pPr>
-    <w:rPr>
-      <w:rFonts w:eastAsiaTheme="majorEastAsia" w:cstheme="majorBidi"/>
-      <w:color w:val="0F4761" w:themeColor="accent1" w:themeShade="BF"/>
-      <w:sz w:val="28"/>
-      <w:szCs w:val="28"/>
-    </w:rPr>
-  </w:style>
-  <w:style w:type="paragraph" w:styleId="Heading4">
-    <w:name w:val="heading 4"/>
-    <w:basedOn w:val="Normal"/>
-    <w:next w:val="FirstParagraph"/>
-    <w:link w:val="Heading4Char"/>
-    <w:uiPriority w:val="9"/>
-    <w:semiHidden/>
-    <w:unhideWhenUsed/>
-    <w:qFormat/>
-    <w:rsid w:val="00F81AA1"/>
-    <w:pPr>
-      <w:keepNext/>
-      <w:keepLines/>
-      <w:numPr>
-        <w:ilvl w:val="3"/>
-        <w:numId w:val="1"/>
-      </w:numPr>
-      <w:spacing w:before="80" w:after="40"/>
-      <w:outlineLvl w:val="3"/>
-    </w:pPr>
-    <w:rPr>
-      <w:rFonts w:eastAsiaTheme="majorEastAsia" w:cstheme="majorBidi"/>
-      <w:i/>
-      <w:iCs/>
-      <w:color w:val="0F4761" w:themeColor="accent1" w:themeShade="BF"/>
-    </w:rPr>
-  </w:style>
-  <w:style w:type="paragraph" w:styleId="Heading5">
-    <w:name w:val="heading 5"/>
-    <w:basedOn w:val="Normal"/>
-    <w:next w:val="FirstParagraph"/>
-    <w:link w:val="Heading5Char"/>
-    <w:uiPriority w:val="9"/>
-    <w:semiHidden/>
-    <w:unhideWhenUsed/>
-    <w:qFormat/>
-    <w:rsid w:val="00F81AA1"/>
-    <w:pPr>
-      <w:keepNext/>
-      <w:keepLines/>
-      <w:numPr>
-        <w:ilvl w:val="4"/>
-        <w:numId w:val="1"/>
-      </w:numPr>
-      <w:spacing w:before="80" w:after="40"/>
-      <w:outlineLvl w:val="4"/>
-    </w:pPr>
-    <w:rPr>
-      <w:rFonts w:eastAsiaTheme="majorEastAsia" w:cstheme="majorBidi"/>
-      <w:color w:val="0F4761" w:themeColor="accent1" w:themeShade="BF"/>
-    </w:rPr>
-  </w:style>
-  <w:style w:type="paragraph" w:styleId="Heading6">
-    <w:name w:val="heading 6"/>
-    <w:basedOn w:val="Normal"/>
-    <w:next w:val="FirstParagraph"/>
-    <w:link w:val="Heading6Char"/>
-    <w:uiPriority w:val="9"/>
-    <w:semiHidden/>
-    <w:unhideWhenUsed/>
-    <w:qFormat/>
-    <w:rsid w:val="00F81AA1"/>
-    <w:pPr>
-      <w:keepNext/>
-      <w:keepLines/>
-      <w:numPr>
-        <w:ilvl w:val="5"/>
-        <w:numId w:val="1"/>
-      </w:numPr>
-      <w:spacing w:before="40" w:after="0"/>
-      <w:outlineLvl w:val="5"/>
-    </w:pPr>
-    <w:rPr>
-      <w:rFonts w:eastAsiaTheme="majorEastAsia" w:cstheme="majorBidi"/>
-      <w:i/>
-      <w:iCs/>
-      <w:color w:val="595959" w:themeColor="text1" w:themeTint="A6"/>
-    </w:rPr>
-  </w:style>
-  <w:style w:type="character" w:default="1" w:styleId="DefaultParagraphFont">
+  <w:style w:type="character" w:styleId="DefaultParagraphFont" w:default="1">
     <w:name w:val="Default Paragraph Font"/>
     <w:uiPriority w:val="1"/>
     <w:semiHidden/>
     <w:unhideWhenUsed/>
   </w:style>
-  <w:style w:type="table" w:default="1" w:styleId="TableNormal">
+  <w:style w:type="table" w:styleId="TableNormal" w:default="1">
     <w:name w:val="Normal Table"/>
     <w:uiPriority w:val="99"/>
     <w:semiHidden/>
@@ -1676,121 +1698,79 @@
       </w:tblCellMar>
     </w:tblPr>
   </w:style>
-  <w:style w:type="numbering" w:default="1" w:styleId="NoList">
+  <w:style w:type="numbering" w:styleId="NoList" w:default="1">
     <w:name w:val="No List"/>
     <w:uiPriority w:val="99"/>
     <w:semiHidden/>
     <w:unhideWhenUsed/>
   </w:style>
-  <w:style w:type="character" w:customStyle="1" w:styleId="Heading1Char">
-    <w:name w:val="Heading 1 Char"/>
-    <w:basedOn w:val="DefaultParagraphFont"/>
-    <w:link w:val="Heading1"/>
-    <w:uiPriority w:val="9"/>
-    <w:rsid w:val="00F81AA1"/>
-    <w:rPr>
-      <w:rFonts w:asciiTheme="majorHAnsi" w:eastAsiaTheme="majorEastAsia" w:hAnsiTheme="majorHAnsi" w:cstheme="majorBidi"/>
-      <w:color w:val="0F4761" w:themeColor="accent1" w:themeShade="BF"/>
-      <w:sz w:val="40"/>
-      <w:szCs w:val="40"/>
-    </w:rPr>
-  </w:style>
-  <w:style w:type="character" w:customStyle="1" w:styleId="Heading2Char">
-    <w:name w:val="Heading 2 Char"/>
-    <w:basedOn w:val="DefaultParagraphFont"/>
-    <w:link w:val="Heading2"/>
-    <w:uiPriority w:val="9"/>
-    <w:semiHidden/>
-    <w:rsid w:val="00F81AA1"/>
-    <w:rPr>
-      <w:rFonts w:asciiTheme="majorHAnsi" w:eastAsiaTheme="majorEastAsia" w:hAnsiTheme="majorHAnsi" w:cstheme="majorBidi"/>
-      <w:color w:val="0F4761" w:themeColor="accent1" w:themeShade="BF"/>
-      <w:sz w:val="32"/>
-      <w:szCs w:val="32"/>
-    </w:rPr>
-  </w:style>
-  <w:style w:type="character" w:customStyle="1" w:styleId="Heading3Char">
-    <w:name w:val="Heading 3 Char"/>
-    <w:basedOn w:val="DefaultParagraphFont"/>
-    <w:link w:val="Heading3"/>
-    <w:uiPriority w:val="9"/>
-    <w:semiHidden/>
-    <w:rsid w:val="00F81AA1"/>
-    <w:rPr>
-      <w:rFonts w:eastAsiaTheme="majorEastAsia" w:cstheme="majorBidi"/>
-      <w:color w:val="0F4761" w:themeColor="accent1" w:themeShade="BF"/>
-      <w:sz w:val="28"/>
-      <w:szCs w:val="28"/>
-    </w:rPr>
-  </w:style>
-  <w:style w:type="character" w:customStyle="1" w:styleId="Heading4Char">
-    <w:name w:val="Heading 4 Char"/>
-    <w:basedOn w:val="DefaultParagraphFont"/>
-    <w:link w:val="Heading4"/>
-    <w:uiPriority w:val="9"/>
-    <w:semiHidden/>
-    <w:rsid w:val="00F81AA1"/>
-    <w:rPr>
-      <w:rFonts w:eastAsiaTheme="majorEastAsia" w:cstheme="majorBidi"/>
-      <w:i/>
-      <w:iCs/>
-      <w:color w:val="0F4761" w:themeColor="accent1" w:themeShade="BF"/>
-    </w:rPr>
-  </w:style>
-  <w:style w:type="character" w:customStyle="1" w:styleId="Heading5Char">
-    <w:name w:val="Heading 5 Char"/>
-    <w:basedOn w:val="DefaultParagraphFont"/>
-    <w:link w:val="Heading5"/>
-    <w:uiPriority w:val="9"/>
-    <w:semiHidden/>
-    <w:rsid w:val="00F81AA1"/>
-    <w:rPr>
-      <w:rFonts w:eastAsiaTheme="majorEastAsia" w:cstheme="majorBidi"/>
-      <w:color w:val="0F4761" w:themeColor="accent1" w:themeShade="BF"/>
-    </w:rPr>
-  </w:style>
-  <w:style w:type="character" w:customStyle="1" w:styleId="Heading6Char">
-    <w:name w:val="Heading 6 Char"/>
-    <w:basedOn w:val="DefaultParagraphFont"/>
-    <w:link w:val="Heading6"/>
-    <w:uiPriority w:val="9"/>
-    <w:semiHidden/>
-    <w:rsid w:val="00F81AA1"/>
-    <w:rPr>
-      <w:rFonts w:eastAsiaTheme="majorEastAsia" w:cstheme="majorBidi"/>
-      <w:i/>
-      <w:iCs/>
-      <w:color w:val="595959" w:themeColor="text1" w:themeTint="A6"/>
-    </w:rPr>
+  <w:style w:type="paragraph" w:styleId="Header">
+    <w:name w:val="header"/>
+    <w:basedOn w:val="Normal"/>
+    <w:uiPriority w:val="99"/>
+    <w:unhideWhenUsed/>
+    <w:rsid w:val="21362DC7"/>
+    <w:pPr>
+      <w:tabs>
+        <w:tab w:val="center" w:leader="none" w:pos="4680"/>
+        <w:tab w:val="right" w:leader="none" w:pos="9360"/>
+      </w:tabs>
+      <w:spacing w:after="0" w:line="240" w:lineRule="auto"/>
+    </w:pPr>
+  </w:style>
+  <w:style w:type="paragraph" w:styleId="Footer">
+    <w:name w:val="footer"/>
+    <w:basedOn w:val="Normal"/>
+    <w:uiPriority w:val="99"/>
+    <w:unhideWhenUsed/>
+    <w:rsid w:val="21362DC7"/>
+    <w:pPr>
+      <w:tabs>
+        <w:tab w:val="center" w:leader="none" w:pos="4680"/>
+        <w:tab w:val="right" w:leader="none" w:pos="9360"/>
+      </w:tabs>
+      <w:spacing w:after="0" w:line="240" w:lineRule="auto"/>
+    </w:pPr>
   </w:style>
   <w:style w:type="paragraph" w:styleId="Quote">
     <w:name w:val="Quote"/>
     <w:basedOn w:val="Normal"/>
     <w:next w:val="FirstParagraph"/>
-    <w:link w:val="QuoteChar"/>
     <w:uiPriority w:val="29"/>
     <w:qFormat/>
-    <w:rsid w:val="00F81AA1"/>
+    <w:rsid w:val="4425367B"/>
     <w:pPr>
       <w:spacing w:before="160"/>
       <w:ind w:left="720"/>
     </w:pPr>
     <w:rPr>
-      <w:i/>
-      <w:iCs/>
-      <w:color w:val="404040" w:themeColor="text1" w:themeTint="BF"/>
-    </w:rPr>
-  </w:style>
-  <w:style w:type="character" w:customStyle="1" w:styleId="QuoteChar">
-    <w:name w:val="Quote Char"/>
-    <w:basedOn w:val="DefaultParagraphFont"/>
-    <w:link w:val="Quote"/>
-    <w:uiPriority w:val="29"/>
-    <w:rsid w:val="00F81AA1"/>
-    <w:rPr>
-      <w:i/>
-      <w:iCs/>
-      <w:color w:val="404040" w:themeColor="text1" w:themeTint="BF"/>
+      <w:i w:val="1"/>
+      <w:iCs w:val="1"/>
+      <w:color w:val="404040" w:themeColor="text1" w:themeTint="BF" w:themeShade="FF"/>
+    </w:rPr>
+  </w:style>
+  <w:style w:type="paragraph" w:styleId="Heading1">
+    <w:name w:val="heading 1"/>
+    <w:basedOn w:val="Normal"/>
+    <w:next w:val="FirstParagraph"/>
+    <w:uiPriority w:val="9"/>
+    <w:qFormat/>
+    <w:rsid w:val="4425367B"/>
+    <w:pPr>
+      <w:keepNext w:val="1"/>
+      <w:keepLines w:val="1"/>
+      <w:numPr>
+        <w:ilvl w:val="1"/>
+        <w:numId w:val="4"/>
+      </w:numPr>
+      <w:spacing w:before="360" w:after="80"/>
+      <w:outlineLvl w:val="0"/>
+    </w:pPr>
+    <w:rPr>
+      <w:rFonts w:ascii="Aptos Display" w:hAnsi="Aptos Display" w:eastAsia="" w:cs="" w:asciiTheme="majorAscii" w:hAnsiTheme="majorAscii" w:eastAsiaTheme="majorEastAsia" w:cstheme="majorBidi"/>
+      <w:color w:val="0F4761" w:themeColor="accent1" w:themeTint="FF" w:themeShade="BF"/>
+      <w:sz w:val="40"/>
+      <w:szCs w:val="40"/>
     </w:rPr>
   </w:style>
   <w:style w:type="paragraph" w:styleId="ListParagraph">
@@ -1798,11 +1778,152 @@
     <w:basedOn w:val="Normal"/>
     <w:uiPriority w:val="34"/>
     <w:qFormat/>
-    <w:rsid w:val="00F81AA1"/>
+    <w:rsid w:val="4425367B"/>
     <w:pPr>
+      <w:spacing/>
       <w:ind w:left="720"/>
       <w:contextualSpacing/>
     </w:pPr>
+  </w:style>
+  <w:style w:type="paragraph" w:styleId="Heading2">
+    <w:name w:val="heading 2"/>
+    <w:basedOn w:val="Normal"/>
+    <w:next w:val="FirstParagraph"/>
+    <w:uiPriority w:val="9"/>
+    <w:unhideWhenUsed/>
+    <w:qFormat/>
+    <w:rsid w:val="4425367B"/>
+    <w:pPr>
+      <w:keepNext w:val="1"/>
+      <w:keepLines w:val="1"/>
+      <w:numPr>
+        <w:ilvl w:val="2"/>
+        <w:numId w:val="4"/>
+      </w:numPr>
+      <w:spacing w:before="160" w:after="80"/>
+      <w:outlineLvl w:val="1"/>
+    </w:pPr>
+    <w:rPr>
+      <w:rFonts w:ascii="Aptos Display" w:hAnsi="Aptos Display" w:eastAsia="" w:cs="" w:asciiTheme="majorAscii" w:hAnsiTheme="majorAscii" w:eastAsiaTheme="majorEastAsia" w:cstheme="majorBidi"/>
+      <w:color w:val="0F4761" w:themeColor="accent1" w:themeTint="FF" w:themeShade="BF"/>
+      <w:sz w:val="32"/>
+      <w:szCs w:val="32"/>
+    </w:rPr>
+  </w:style>
+  <w:style w:type="paragraph" w:styleId="Heading3">
+    <w:name w:val="heading 3"/>
+    <w:basedOn w:val="Normal"/>
+    <w:next w:val="FirstParagraph"/>
+    <w:uiPriority w:val="9"/>
+    <w:unhideWhenUsed/>
+    <w:qFormat/>
+    <w:rsid w:val="4425367B"/>
+    <w:pPr>
+      <w:keepNext w:val="1"/>
+      <w:keepLines w:val="1"/>
+      <w:numPr>
+        <w:ilvl w:val="3"/>
+        <w:numId w:val="4"/>
+      </w:numPr>
+      <w:spacing w:before="160" w:after="80"/>
+      <w:outlineLvl w:val="2"/>
+    </w:pPr>
+    <w:rPr>
+      <w:rFonts w:eastAsia="" w:cs="" w:eastAsiaTheme="majorEastAsia" w:cstheme="majorBidi"/>
+      <w:color w:val="0F4761" w:themeColor="accent1" w:themeTint="FF" w:themeShade="BF"/>
+      <w:sz w:val="28"/>
+      <w:szCs w:val="28"/>
+    </w:rPr>
+  </w:style>
+  <w:style w:type="paragraph" w:styleId="Heading4">
+    <w:name w:val="heading 4"/>
+    <w:basedOn w:val="Normal"/>
+    <w:next w:val="FirstParagraph"/>
+    <w:uiPriority w:val="9"/>
+    <w:unhideWhenUsed/>
+    <w:qFormat/>
+    <w:rsid w:val="4425367B"/>
+    <w:pPr>
+      <w:keepNext w:val="1"/>
+      <w:keepLines w:val="1"/>
+      <w:numPr>
+        <w:ilvl w:val="4"/>
+        <w:numId w:val="4"/>
+      </w:numPr>
+      <w:spacing w:before="80" w:after="40"/>
+      <w:outlineLvl w:val="3"/>
+    </w:pPr>
+    <w:rPr>
+      <w:rFonts w:eastAsia="" w:cs="" w:eastAsiaTheme="majorEastAsia" w:cstheme="majorBidi"/>
+      <w:i w:val="1"/>
+      <w:iCs w:val="1"/>
+      <w:color w:val="0F4761" w:themeColor="accent1" w:themeTint="FF" w:themeShade="BF"/>
+    </w:rPr>
+  </w:style>
+  <w:style w:type="paragraph" w:styleId="Heading5">
+    <w:name w:val="heading 5"/>
+    <w:basedOn w:val="Normal"/>
+    <w:next w:val="FirstParagraph"/>
+    <w:uiPriority w:val="9"/>
+    <w:unhideWhenUsed/>
+    <w:qFormat/>
+    <w:rsid w:val="4425367B"/>
+    <w:pPr>
+      <w:keepNext w:val="1"/>
+      <w:keepLines w:val="1"/>
+      <w:numPr>
+        <w:ilvl w:val="5"/>
+        <w:numId w:val="4"/>
+      </w:numPr>
+      <w:spacing w:before="80" w:after="40"/>
+      <w:outlineLvl w:val="4"/>
+    </w:pPr>
+    <w:rPr>
+      <w:rFonts w:eastAsia="" w:cs="" w:eastAsiaTheme="majorEastAsia" w:cstheme="majorBidi"/>
+      <w:color w:val="0F4761" w:themeColor="accent1" w:themeTint="FF" w:themeShade="BF"/>
+    </w:rPr>
+  </w:style>
+  <w:style w:type="paragraph" w:styleId="Heading6">
+    <w:name w:val="heading 6"/>
+    <w:basedOn w:val="Normal"/>
+    <w:next w:val="FirstParagraph"/>
+    <w:uiPriority w:val="9"/>
+    <w:unhideWhenUsed/>
+    <w:qFormat/>
+    <w:rsid w:val="4425367B"/>
+    <w:pPr>
+      <w:keepNext w:val="1"/>
+      <w:keepLines w:val="1"/>
+      <w:spacing w:before="40" w:after="0"/>
+      <w:outlineLvl w:val="5"/>
+    </w:pPr>
+    <w:rPr>
+      <w:rFonts w:eastAsia="" w:cs="" w:eastAsiaTheme="majorEastAsia" w:cstheme="majorBidi"/>
+      <w:i w:val="1"/>
+      <w:iCs w:val="1"/>
+      <w:color w:val="595959" w:themeColor="text1" w:themeTint="A6" w:themeShade="FF"/>
+    </w:rPr>
+  </w:style>
+  <w:style w:type="paragraph" w:styleId="Title">
+    <w:name w:val="Title"/>
+    <w:basedOn w:val="Normal"/>
+    <w:next w:val="FirstParagraph"/>
+    <w:uiPriority w:val="10"/>
+    <w:qFormat/>
+    <w:rsid w:val="4425367B"/>
+    <w:pPr>
+      <w:numPr>
+        <w:ilvl w:val="0"/>
+        <w:numId w:val="4"/>
+      </w:numPr>
+      <w:spacing w:after="80" w:line="240" w:lineRule="auto"/>
+      <w:contextualSpacing/>
+    </w:pPr>
+    <w:rPr>
+      <w:rFonts w:ascii="Aptos Display" w:hAnsi="Aptos Display" w:eastAsia="" w:cs="" w:asciiTheme="majorAscii" w:hAnsiTheme="majorAscii" w:eastAsiaTheme="majorEastAsia" w:cstheme="majorBidi"/>
+      <w:sz w:val="56"/>
+      <w:szCs w:val="56"/>
+    </w:rPr>
   </w:style>
   <w:style w:type="paragraph" w:styleId="BodyText">
     <w:name w:val="Body Text"/>
@@ -1816,6 +1937,16 @@
     <w:next w:val="BodyText"/>
     <w:uiPriority w:val="1"/>
     <w:qFormat/>
+  </w:style>
+  <w:style w:type="paragraph" w:customStyle="1" w:styleId="Centered">
+    <w:name w:val="Centered"/>
+    <w:basedOn w:val="BodyText"/>
+    <w:next w:val="BodyText"/>
+    <w:qFormat/>
+    <w:pPr>
+      <w:ind w:firstLine="0"/>
+      <w:jc w:val="center"/>
+    </w:pPr>
   </w:style>
   <w:style w:type="paragraph" w:customStyle="1" w:styleId="Compact">
     <w:name w:val="Compact"/>
@@ -1896,8 +2027,8 @@
     <w:uiPriority w:val="1"/>
     <w:qFormat/>
     <w:pPr>
+      <w:keepNext/>
       <w:spacing w:after="0"/>
-      <w:keepNext/>
     </w:pPr>
     <w:rPr>
       <w:b/>
@@ -1947,8 +2078,8 @@
     <w:qFormat/>
     <w:pPr>
       <w:keepLines/>
+      <w:shd w:val="clear" w:color="auto" w:fill="FFFFFF"/>
       <w:spacing w:before="120" w:after="120"/>
-      <w:shd w:val="clear" w:color="auto" w:fill="FFFFFF"/>
     </w:pPr>
     <w:rPr>
       <w:rFonts w:ascii="Consolas" w:hAnsi="Consolas" w:cs="Consolas"/>
@@ -2882,7 +3013,7 @@
 </file>
 
 <file path=word/theme/theme1.xml><?xml version="1.0" encoding="utf-8"?>
-<a:theme xmlns:a="http://schemas.openxmlformats.org/drawingml/2006/main" name="Office Theme">
+<a:theme xmlns:thm15="http://schemas.microsoft.com/office/thememl/2012/main" xmlns:a="http://schemas.openxmlformats.org/drawingml/2006/main" name="Office Theme">
   <a:themeElements>
     <a:clrScheme name="Office">
       <a:dk1>
@@ -2927,9 +3058,9 @@
         <a:latin typeface="Aptos Display" panose="02110004020202020204"/>
         <a:ea typeface=""/>
         <a:cs typeface=""/>
-        <a:font script="Jpan" typeface="游ゴシック Light"/>
+        <a:font script="Jpan" typeface="ＭＳ ゴシック"/>
         <a:font script="Hang" typeface="맑은 고딕"/>
-        <a:font script="Hans" typeface="等线 Light"/>
+        <a:font script="Hans" typeface="宋体"/>
         <a:font script="Hant" typeface="新細明體"/>
         <a:font script="Arab" typeface="Times New Roman"/>
         <a:font script="Hebr" typeface="Times New Roman"/>
@@ -2957,31 +3088,14 @@
         <a:font script="Viet" typeface="Times New Roman"/>
         <a:font script="Uigh" typeface="Microsoft Uighur"/>
         <a:font script="Geor" typeface="Sylfaen"/>
-        <a:font script="Armn" typeface="Arial"/>
-        <a:font script="Bugi" typeface="Leelawadee UI"/>
-        <a:font script="Bopo" typeface="Microsoft JhengHei"/>
-        <a:font script="Java" typeface="Javanese Text"/>
-        <a:font script="Lisu" typeface="Segoe UI"/>
-        <a:font script="Mymr" typeface="Myanmar Text"/>
-        <a:font script="Nkoo" typeface="Ebrima"/>
-        <a:font script="Olck" typeface="Nirmala UI"/>
-        <a:font script="Osma" typeface="Ebrima"/>
-        <a:font script="Phag" typeface="Phagspa"/>
-        <a:font script="Syrn" typeface="Estrangelo Edessa"/>
-        <a:font script="Syrj" typeface="Estrangelo Edessa"/>
-        <a:font script="Syre" typeface="Estrangelo Edessa"/>
-        <a:font script="Sora" typeface="Nirmala UI"/>
-        <a:font script="Tale" typeface="Microsoft Tai Le"/>
-        <a:font script="Talu" typeface="Microsoft New Tai Lue"/>
-        <a:font script="Tfng" typeface="Ebrima"/>
       </a:majorFont>
       <a:minorFont>
         <a:latin typeface="Aptos" panose="02110004020202020204"/>
         <a:ea typeface=""/>
         <a:cs typeface=""/>
-        <a:font script="Jpan" typeface="游明朝"/>
+        <a:font script="Jpan" typeface="ＭＳ 明朝"/>
         <a:font script="Hang" typeface="맑은 고딕"/>
-        <a:font script="Hans" typeface="等线"/>
+        <a:font script="Hans" typeface="宋体"/>
         <a:font script="Hant" typeface="新細明體"/>
         <a:font script="Arab" typeface="Arial"/>
         <a:font script="Hebr" typeface="Arial"/>
@@ -3009,23 +3123,6 @@
         <a:font script="Viet" typeface="Arial"/>
         <a:font script="Uigh" typeface="Microsoft Uighur"/>
         <a:font script="Geor" typeface="Sylfaen"/>
-        <a:font script="Armn" typeface="Arial"/>
-        <a:font script="Bugi" typeface="Leelawadee UI"/>
-        <a:font script="Bopo" typeface="Microsoft JhengHei"/>
-        <a:font script="Java" typeface="Javanese Text"/>
-        <a:font script="Lisu" typeface="Segoe UI"/>
-        <a:font script="Mymr" typeface="Myanmar Text"/>
-        <a:font script="Nkoo" typeface="Ebrima"/>
-        <a:font script="Olck" typeface="Nirmala UI"/>
-        <a:font script="Osma" typeface="Ebrima"/>
-        <a:font script="Phag" typeface="Phagspa"/>
-        <a:font script="Syrn" typeface="Estrangelo Edessa"/>
-        <a:font script="Syrj" typeface="Estrangelo Edessa"/>
-        <a:font script="Syre" typeface="Estrangelo Edessa"/>
-        <a:font script="Sora" typeface="Nirmala UI"/>
-        <a:font script="Tale" typeface="Microsoft Tai Le"/>
-        <a:font script="Talu" typeface="Microsoft New Tai Lue"/>
-        <a:font script="Tfng" typeface="Ebrima"/>
       </a:minorFont>
     </a:fontScheme>
     <a:fmtScheme name="Office">
@@ -3087,6 +3184,13 @@
         </a:gradFill>
       </a:fillStyleLst>
       <a:lnStyleLst>
+        <a:ln w="6350" cap="flat" cmpd="sng" algn="ctr">
+          <a:solidFill>
+            <a:schemeClr val="phClr"/>
+          </a:solidFill>
+          <a:prstDash val="solid"/>
+          <a:miter lim="800000"/>
+        </a:ln>
         <a:ln w="12700" cap="flat" cmpd="sng" algn="ctr">
           <a:solidFill>
             <a:schemeClr val="phClr"/>
@@ -3095,13 +3199,6 @@
           <a:miter lim="800000"/>
         </a:ln>
         <a:ln w="19050" cap="flat" cmpd="sng" algn="ctr">
-          <a:solidFill>
-            <a:schemeClr val="phClr"/>
-          </a:solidFill>
-          <a:prstDash val="solid"/>
-          <a:miter lim="800000"/>
-        </a:ln>
-        <a:ln w="25400" cap="flat" cmpd="sng" algn="ctr">
           <a:solidFill>
             <a:schemeClr val="phClr"/>
           </a:solidFill>
@@ -3166,38 +3263,18 @@
       </a:bgFillStyleLst>
     </a:fmtScheme>
   </a:themeElements>
-  <a:objectDefaults>
-    <a:lnDef>
-      <a:spPr/>
-      <a:bodyPr/>
-      <a:lstStyle/>
-      <a:style>
-        <a:lnRef idx="2">
-          <a:schemeClr val="accent1"/>
-        </a:lnRef>
-        <a:fillRef idx="0">
-          <a:schemeClr val="accent1"/>
-        </a:fillRef>
-        <a:effectRef idx="1">
-          <a:schemeClr val="accent1"/>
-        </a:effectRef>
-        <a:fontRef idx="minor">
-          <a:schemeClr val="tx1"/>
-        </a:fontRef>
-      </a:style>
-    </a:lnDef>
-  </a:objectDefaults>
+  <a:objectDefaults/>
   <a:extraClrSchemeLst/>
   <a:extLst>
     <a:ext uri="{05A4C25C-085E-4340-85A3-A5531E510DB2}">
-      <thm15:themeFamily xmlns:thm15="http://schemas.microsoft.com/office/thememl/2012/main" name="Office Theme" id="{2E142A2C-CD16-42D6-873A-C26D2A0506FA}" vid="{1BDDFF52-6CD6-40A5-AB3C-68EB2F1E4D0A}"/>
+      <thm15:themeFamily xmlns:thm15="http://schemas.microsoft.com/office/thememl/2012/main" name="Office Theme" id="{62F939B6-93AF-4DB8-9C6B-D6C7DFDC589F}" vid="{4A3C46E8-61CC-4603-A589-7422A47A8E4A}"/>
     </a:ext>
   </a:extLst>
 </a:theme>
 </file>
 
 <file path=customXml/item1.xml><?xml version="1.0" encoding="utf-8"?>
-<ns0:fields xmlns:ns0="urn:mdhtml:fields">
+<ns0:fields xmlns="" xmlns:ns0="urn:mdhtml:fields">
   <ns0:company_common_name/>
   <ns0:candidate_name/>
   <ns0:job_title/>

</xml_diff>